<commit_message>
docs: update contact info and pl06
</commit_message>
<xml_diff>
--- a/docs/final-report.docx
+++ b/docs/final-report.docx
@@ -399,13 +399,13 @@
         <w:tblLook w:val="04A0" w:firstRow="1" w:lastRow="0" w:firstColumn="1" w:lastColumn="0" w:noHBand="0" w:noVBand="1"/>
       </w:tblPr>
       <w:tblGrid>
-        <w:gridCol w:w="3679"/>
-        <w:gridCol w:w="5666"/>
+        <w:gridCol w:w="3539"/>
+        <w:gridCol w:w="5806"/>
       </w:tblGrid>
       <w:tr>
         <w:tc>
           <w:tcPr>
-            <w:tcW w:w="3681" w:type="dxa"/>
+            <w:tcW w:w="3539" w:type="dxa"/>
           </w:tcPr>
           <w:p>
             <w:pPr>
@@ -427,7 +427,7 @@
         </w:tc>
         <w:tc>
           <w:tcPr>
-            <w:tcW w:w="5669" w:type="dxa"/>
+            <w:tcW w:w="5806" w:type="dxa"/>
           </w:tcPr>
           <w:p>
             <w:pPr>
@@ -451,7 +451,7 @@
       <w:tr>
         <w:tc>
           <w:tcPr>
-            <w:tcW w:w="3681" w:type="dxa"/>
+            <w:tcW w:w="3539" w:type="dxa"/>
           </w:tcPr>
           <w:p>
             <w:pPr>
@@ -469,7 +469,7 @@
         </w:tc>
         <w:tc>
           <w:tcPr>
-            <w:tcW w:w="5669" w:type="dxa"/>
+            <w:tcW w:w="5806" w:type="dxa"/>
           </w:tcPr>
           <w:p>
             <w:pPr>
@@ -489,7 +489,7 @@
       <w:tr>
         <w:tc>
           <w:tcPr>
-            <w:tcW w:w="3681" w:type="dxa"/>
+            <w:tcW w:w="3539" w:type="dxa"/>
           </w:tcPr>
           <w:p>
             <w:pPr>
@@ -507,7 +507,7 @@
         </w:tc>
         <w:tc>
           <w:tcPr>
-            <w:tcW w:w="5669" w:type="dxa"/>
+            <w:tcW w:w="5806" w:type="dxa"/>
           </w:tcPr>
           <w:p>
             <w:pPr>
@@ -3404,6 +3404,7 @@
   <w:style w:type="character" w:default="1" w:styleId="DefaultParagraphFont">
     <w:name w:val="Default Paragraph Font"/>
     <w:uiPriority w:val="1"/>
+    <w:semiHidden/>
     <w:unhideWhenUsed/>
   </w:style>
   <w:style w:type="table" w:default="1" w:styleId="TableNormal">

</xml_diff>